<commit_message>
Merubah template permohonan akreditasi
</commit_message>
<xml_diff>
--- a/public/assets/file/TEMPLATE PERMOHONAN AKREDITASI.docx
+++ b/public/assets/file/TEMPLATE PERMOHONAN AKREDITASI.docx
@@ -32,31 +32,13 @@
           <w:szCs w:val="20"/>
         </w:rPr>
       </w:pPr>
-      <w:proofErr w:type="spellStart"/>
       <w:r>
         <w:rPr>
           <w:sz w:val="24"/>
           <w:szCs w:val="24"/>
         </w:rPr>
-        <w:t>Nomor</w:t>
+        <w:t>Nomor: …………………………………………</w:t>
       </w:r>
-      <w:proofErr w:type="spellEnd"/>
-      <w:r>
-        <w:rPr>
-          <w:sz w:val="24"/>
-          <w:szCs w:val="24"/>
-        </w:rPr>
-        <w:t>: ……………………………………………</w:t>
-      </w:r>
-    </w:p>
-    <w:p>
-      <w:pPr>
-        <w:spacing w:after="120"/>
-        <w:rPr>
-          <w:b/>
-          <w:bCs/>
-        </w:rPr>
-      </w:pPr>
     </w:p>
     <w:p>
       <w:pPr>
@@ -67,36 +49,28 @@
           <w:b/>
           <w:bCs/>
         </w:rPr>
-        <w:t xml:space="preserve">Lembaga </w:t>
-      </w:r>
-      <w:proofErr w:type="spellStart"/>
-      <w:r>
-        <w:rPr>
-          <w:b/>
-          <w:bCs/>
-        </w:rPr>
-        <w:t>Penjaminan</w:t>
-      </w:r>
-      <w:proofErr w:type="spellEnd"/>
-      <w:r>
-        <w:rPr>
-          <w:b/>
-          <w:bCs/>
-        </w:rPr>
-        <w:t xml:space="preserve"> Mutu</w:t>
+        <w:t>Lembaga Penjaminan Mutu</w:t>
       </w:r>
     </w:p>
     <w:tbl>
       <w:tblPr>
         <w:tblStyle w:val="FormTable"/>
-        <w:tblW w:w="0" w:type="auto"/>
+        <w:tblW w:w="9351" w:type="dxa"/>
         <w:tblInd w:w="0" w:type="dxa"/>
+        <w:tblBorders>
+          <w:top w:val="none" w:sz="0" w:space="0" w:color="auto"/>
+          <w:left w:val="none" w:sz="0" w:space="0" w:color="auto"/>
+          <w:bottom w:val="none" w:sz="0" w:space="0" w:color="auto"/>
+          <w:right w:val="none" w:sz="0" w:space="0" w:color="auto"/>
+          <w:insideH w:val="none" w:sz="0" w:space="0" w:color="auto"/>
+          <w:insideV w:val="none" w:sz="0" w:space="0" w:color="auto"/>
+        </w:tblBorders>
         <w:tblLook w:val="04A0" w:firstRow="1" w:lastRow="0" w:firstColumn="1" w:lastColumn="0" w:noHBand="0" w:noVBand="1"/>
       </w:tblPr>
       <w:tblGrid>
-        <w:gridCol w:w="5200"/>
-        <w:gridCol w:w="300"/>
-        <w:gridCol w:w="3200"/>
+        <w:gridCol w:w="4105"/>
+        <w:gridCol w:w="299"/>
+        <w:gridCol w:w="4956"/>
       </w:tblGrid>
       <w:tr>
         <w:trPr>
@@ -104,26 +78,24 @@
         </w:trPr>
         <w:tc>
           <w:tcPr>
-            <w:tcW w:w="5200" w:type="dxa"/>
-            <w:noWrap/>
-          </w:tcPr>
-          <w:p>
-            <w:pPr>
-              <w:spacing w:after="0"/>
-            </w:pPr>
-            <w:r>
-              <w:t>Universitas/</w:t>
-            </w:r>
-            <w:proofErr w:type="spellStart"/>
-            <w:r>
-              <w:t>Institut</w:t>
-            </w:r>
-            <w:proofErr w:type="spellEnd"/>
-          </w:p>
-        </w:tc>
-        <w:tc>
-          <w:tcPr>
-            <w:tcW w:w="300" w:type="dxa"/>
+            <w:tcW w:w="4106" w:type="dxa"/>
+            <w:noWrap/>
+          </w:tcPr>
+          <w:p>
+            <w:pPr>
+              <w:spacing w:after="0"/>
+            </w:pPr>
+            <w:r>
+              <w:rPr>
+                <w:highlight w:val="yellow"/>
+              </w:rPr>
+              <w:t>Nama Perguruan Tinggi</w:t>
+            </w:r>
+          </w:p>
+        </w:tc>
+        <w:tc>
+          <w:tcPr>
+            <w:tcW w:w="284" w:type="dxa"/>
             <w:noWrap/>
           </w:tcPr>
           <w:p>
@@ -137,7 +109,7 @@
         </w:tc>
         <w:tc>
           <w:tcPr>
-            <w:tcW w:w="3200" w:type="dxa"/>
+            <w:tcW w:w="4961" w:type="dxa"/>
             <w:noWrap/>
           </w:tcPr>
           <w:p>
@@ -159,29 +131,21 @@
         </w:trPr>
         <w:tc>
           <w:tcPr>
-            <w:tcW w:w="5200" w:type="dxa"/>
-            <w:noWrap/>
-          </w:tcPr>
-          <w:p>
-            <w:pPr>
-              <w:spacing w:after="0"/>
-            </w:pPr>
-            <w:r>
-              <w:t xml:space="preserve">Lembaga </w:t>
-            </w:r>
-            <w:proofErr w:type="spellStart"/>
-            <w:r>
-              <w:t>Penjaminan</w:t>
-            </w:r>
-            <w:proofErr w:type="spellEnd"/>
-            <w:r>
-              <w:t xml:space="preserve"> Mutu</w:t>
-            </w:r>
-          </w:p>
-        </w:tc>
-        <w:tc>
-          <w:tcPr>
-            <w:tcW w:w="300" w:type="dxa"/>
+            <w:tcW w:w="4106" w:type="dxa"/>
+            <w:noWrap/>
+          </w:tcPr>
+          <w:p>
+            <w:pPr>
+              <w:spacing w:after="0"/>
+            </w:pPr>
+            <w:r>
+              <w:t>Lembaga Penjaminan Mutu</w:t>
+            </w:r>
+          </w:p>
+        </w:tc>
+        <w:tc>
+          <w:tcPr>
+            <w:tcW w:w="284" w:type="dxa"/>
             <w:noWrap/>
           </w:tcPr>
           <w:p>
@@ -195,7 +159,7 @@
         </w:tc>
         <w:tc>
           <w:tcPr>
-            <w:tcW w:w="3200" w:type="dxa"/>
+            <w:tcW w:w="4961" w:type="dxa"/>
             <w:noWrap/>
           </w:tcPr>
           <w:p>
@@ -214,7 +178,7 @@
         </w:trPr>
         <w:tc>
           <w:tcPr>
-            <w:tcW w:w="5200" w:type="dxa"/>
+            <w:tcW w:w="4106" w:type="dxa"/>
             <w:noWrap/>
           </w:tcPr>
           <w:p>
@@ -228,7 +192,7 @@
         </w:tc>
         <w:tc>
           <w:tcPr>
-            <w:tcW w:w="300" w:type="dxa"/>
+            <w:tcW w:w="284" w:type="dxa"/>
             <w:noWrap/>
           </w:tcPr>
           <w:p>
@@ -242,7 +206,7 @@
         </w:tc>
         <w:tc>
           <w:tcPr>
-            <w:tcW w:w="3200" w:type="dxa"/>
+            <w:tcW w:w="4961" w:type="dxa"/>
             <w:noWrap/>
           </w:tcPr>
           <w:p>
@@ -261,37 +225,21 @@
         </w:trPr>
         <w:tc>
           <w:tcPr>
-            <w:tcW w:w="5200" w:type="dxa"/>
-            <w:noWrap/>
-          </w:tcPr>
-          <w:p>
-            <w:pPr>
-              <w:spacing w:after="0"/>
-            </w:pPr>
-            <w:r>
-              <w:t xml:space="preserve">Mobile </w:t>
-            </w:r>
-            <w:proofErr w:type="spellStart"/>
-            <w:r>
-              <w:t>telp</w:t>
-            </w:r>
-            <w:proofErr w:type="spellEnd"/>
-            <w:r>
-              <w:t xml:space="preserve"> dan/</w:t>
-            </w:r>
-            <w:proofErr w:type="spellStart"/>
-            <w:r>
-              <w:t>atau</w:t>
-            </w:r>
-            <w:proofErr w:type="spellEnd"/>
-            <w:r>
-              <w:t xml:space="preserve"> WA</w:t>
-            </w:r>
-          </w:p>
-        </w:tc>
-        <w:tc>
-          <w:tcPr>
-            <w:tcW w:w="300" w:type="dxa"/>
+            <w:tcW w:w="4106" w:type="dxa"/>
+            <w:noWrap/>
+          </w:tcPr>
+          <w:p>
+            <w:pPr>
+              <w:spacing w:after="0"/>
+            </w:pPr>
+            <w:r>
+              <w:t>Mobile telp dan/atau WA</w:t>
+            </w:r>
+          </w:p>
+        </w:tc>
+        <w:tc>
+          <w:tcPr>
+            <w:tcW w:w="284" w:type="dxa"/>
             <w:noWrap/>
           </w:tcPr>
           <w:p>
@@ -305,7 +253,7 @@
         </w:tc>
         <w:tc>
           <w:tcPr>
-            <w:tcW w:w="3200" w:type="dxa"/>
+            <w:tcW w:w="4961" w:type="dxa"/>
             <w:noWrap/>
           </w:tcPr>
           <w:p>
@@ -324,7 +272,7 @@
         </w:trPr>
         <w:tc>
           <w:tcPr>
-            <w:tcW w:w="5200" w:type="dxa"/>
+            <w:tcW w:w="4106" w:type="dxa"/>
             <w:noWrap/>
           </w:tcPr>
           <w:p>
@@ -338,7 +286,7 @@
         </w:tc>
         <w:tc>
           <w:tcPr>
-            <w:tcW w:w="300" w:type="dxa"/>
+            <w:tcW w:w="284" w:type="dxa"/>
             <w:noWrap/>
           </w:tcPr>
           <w:p>
@@ -352,7 +300,7 @@
         </w:tc>
         <w:tc>
           <w:tcPr>
-            <w:tcW w:w="3200" w:type="dxa"/>
+            <w:tcW w:w="4961" w:type="dxa"/>
             <w:noWrap/>
           </w:tcPr>
           <w:p>
@@ -383,41 +331,36 @@
           <w:b/>
           <w:bCs/>
         </w:rPr>
-        <w:t xml:space="preserve">Program Studi </w:t>
+        <w:t>Program Studi Akreditasi</w:t>
       </w:r>
-      <w:proofErr w:type="spellStart"/>
-      <w:r>
-        <w:rPr>
-          <w:b/>
-          <w:bCs/>
-        </w:rPr>
-        <w:t>Akreditasi</w:t>
-      </w:r>
-      <w:proofErr w:type="spellEnd"/>
     </w:p>
     <w:tbl>
       <w:tblPr>
         <w:tblStyle w:val="FormTable"/>
-        <w:tblW w:w="15100" w:type="dxa"/>
+        <w:tblW w:w="9351" w:type="dxa"/>
         <w:tblInd w:w="0" w:type="dxa"/>
+        <w:tblBorders>
+          <w:top w:val="none" w:sz="0" w:space="0" w:color="auto"/>
+          <w:left w:val="none" w:sz="0" w:space="0" w:color="auto"/>
+          <w:bottom w:val="none" w:sz="0" w:space="0" w:color="auto"/>
+          <w:right w:val="none" w:sz="0" w:space="0" w:color="auto"/>
+          <w:insideH w:val="none" w:sz="0" w:space="0" w:color="auto"/>
+          <w:insideV w:val="none" w:sz="0" w:space="0" w:color="auto"/>
+        </w:tblBorders>
         <w:tblLook w:val="04A0" w:firstRow="1" w:lastRow="0" w:firstColumn="1" w:lastColumn="0" w:noHBand="0" w:noVBand="1"/>
       </w:tblPr>
       <w:tblGrid>
-        <w:gridCol w:w="5200"/>
-        <w:gridCol w:w="300"/>
-        <w:gridCol w:w="4706"/>
-        <w:gridCol w:w="1694"/>
-        <w:gridCol w:w="3200"/>
+        <w:gridCol w:w="4105"/>
+        <w:gridCol w:w="299"/>
+        <w:gridCol w:w="4956"/>
       </w:tblGrid>
       <w:tr>
         <w:trPr>
-          <w:gridAfter w:val="2"/>
-          <w:wAfter w:w="4894" w:type="dxa"/>
           <w:trHeight w:val="380"/>
         </w:trPr>
         <w:tc>
           <w:tcPr>
-            <w:tcW w:w="5200" w:type="dxa"/>
+            <w:tcW w:w="4106" w:type="dxa"/>
             <w:noWrap/>
           </w:tcPr>
           <w:p>
@@ -431,7 +374,7 @@
         </w:tc>
         <w:tc>
           <w:tcPr>
-            <w:tcW w:w="300" w:type="dxa"/>
+            <w:tcW w:w="284" w:type="dxa"/>
             <w:noWrap/>
           </w:tcPr>
           <w:p>
@@ -445,191 +388,15 @@
         </w:tc>
         <w:tc>
           <w:tcPr>
-            <w:tcW w:w="4706" w:type="dxa"/>
-            <w:noWrap/>
-          </w:tcPr>
-          <w:p>
-            <w:pPr>
-              <w:spacing w:after="0"/>
-            </w:pPr>
-            <w:r>
-              <w:t xml:space="preserve"> Sarjana LAMDEPILAR (</w:t>
-            </w:r>
-            <w:proofErr w:type="spellStart"/>
-            <w:r>
-              <w:t>Contoh</w:t>
-            </w:r>
-            <w:proofErr w:type="spellEnd"/>
-            <w:r>
-              <w:t>)</w:t>
-            </w:r>
-          </w:p>
-        </w:tc>
-      </w:tr>
-      <w:tr>
-        <w:trPr>
-          <w:gridAfter w:val="2"/>
-          <w:wAfter w:w="4894" w:type="dxa"/>
-          <w:trHeight w:val="380"/>
-        </w:trPr>
-        <w:tc>
-          <w:tcPr>
-            <w:tcW w:w="5200" w:type="dxa"/>
-            <w:noWrap/>
-          </w:tcPr>
-          <w:p>
-            <w:pPr>
-              <w:spacing w:after="0"/>
-            </w:pPr>
-            <w:r>
-              <w:t xml:space="preserve">Kontak PIC </w:t>
-            </w:r>
-            <w:proofErr w:type="spellStart"/>
-            <w:r>
-              <w:t>Akreditasi</w:t>
-            </w:r>
-            <w:proofErr w:type="spellEnd"/>
-          </w:p>
-        </w:tc>
-        <w:tc>
-          <w:tcPr>
-            <w:tcW w:w="300" w:type="dxa"/>
-            <w:noWrap/>
-          </w:tcPr>
-          <w:p>
-            <w:pPr>
-              <w:spacing w:after="0"/>
-            </w:pPr>
-            <w:r>
-              <w:t>:</w:t>
-            </w:r>
-          </w:p>
-        </w:tc>
-        <w:tc>
-          <w:tcPr>
-            <w:tcW w:w="4706" w:type="dxa"/>
-            <w:noWrap/>
-          </w:tcPr>
-          <w:p>
-            <w:pPr>
-              <w:spacing w:after="0"/>
-            </w:pPr>
-            <w:r>
-              <w:t xml:space="preserve"> </w:t>
-            </w:r>
-          </w:p>
-        </w:tc>
-      </w:tr>
-      <w:tr>
-        <w:trPr>
-          <w:gridAfter w:val="2"/>
-          <w:wAfter w:w="4894" w:type="dxa"/>
-          <w:trHeight w:val="380"/>
-        </w:trPr>
-        <w:tc>
-          <w:tcPr>
-            <w:tcW w:w="5200" w:type="dxa"/>
-            <w:noWrap/>
-          </w:tcPr>
-          <w:p>
-            <w:pPr>
-              <w:spacing w:after="0"/>
-            </w:pPr>
-            <w:r>
-              <w:t>Telp</w:t>
-            </w:r>
-          </w:p>
-        </w:tc>
-        <w:tc>
-          <w:tcPr>
-            <w:tcW w:w="300" w:type="dxa"/>
-            <w:noWrap/>
-          </w:tcPr>
-          <w:p>
-            <w:pPr>
-              <w:spacing w:after="0"/>
-            </w:pPr>
-            <w:r>
-              <w:t>:</w:t>
-            </w:r>
-          </w:p>
-        </w:tc>
-        <w:tc>
-          <w:tcPr>
-            <w:tcW w:w="4706" w:type="dxa"/>
-            <w:noWrap/>
-          </w:tcPr>
-          <w:p>
-            <w:pPr>
-              <w:spacing w:after="0"/>
-            </w:pPr>
-            <w:r>
-              <w:t xml:space="preserve"> 024123456</w:t>
-            </w:r>
-          </w:p>
-        </w:tc>
-      </w:tr>
-      <w:tr>
-        <w:trPr>
-          <w:gridAfter w:val="2"/>
-          <w:wAfter w:w="4894" w:type="dxa"/>
-          <w:trHeight w:val="380"/>
-        </w:trPr>
-        <w:tc>
-          <w:tcPr>
-            <w:tcW w:w="5200" w:type="dxa"/>
-            <w:noWrap/>
-          </w:tcPr>
-          <w:p>
-            <w:pPr>
-              <w:spacing w:after="0"/>
-            </w:pPr>
-            <w:r>
-              <w:t xml:space="preserve">Mobile </w:t>
-            </w:r>
-            <w:proofErr w:type="spellStart"/>
-            <w:r>
-              <w:t>telp</w:t>
-            </w:r>
-            <w:proofErr w:type="spellEnd"/>
-            <w:r>
-              <w:t xml:space="preserve"> dan/</w:t>
-            </w:r>
-            <w:proofErr w:type="spellStart"/>
-            <w:r>
-              <w:t>atau</w:t>
-            </w:r>
-            <w:proofErr w:type="spellEnd"/>
-            <w:r>
-              <w:t xml:space="preserve"> WA</w:t>
-            </w:r>
-          </w:p>
-        </w:tc>
-        <w:tc>
-          <w:tcPr>
-            <w:tcW w:w="300" w:type="dxa"/>
-            <w:noWrap/>
-          </w:tcPr>
-          <w:p>
-            <w:pPr>
-              <w:spacing w:after="0"/>
-            </w:pPr>
-            <w:r>
-              <w:t>:</w:t>
-            </w:r>
-          </w:p>
-        </w:tc>
-        <w:tc>
-          <w:tcPr>
-            <w:tcW w:w="4706" w:type="dxa"/>
-            <w:noWrap/>
-          </w:tcPr>
-          <w:p>
-            <w:pPr>
-              <w:spacing w:after="0"/>
-            </w:pPr>
-            <w:r>
-              <w:t xml:space="preserve"> 088888888</w:t>
+            <w:tcW w:w="4961" w:type="dxa"/>
+            <w:noWrap/>
+          </w:tcPr>
+          <w:p>
+            <w:pPr>
+              <w:spacing w:after="0"/>
+            </w:pPr>
+            <w:r>
+              <w:t xml:space="preserve"> Sarjana LAMDEPILAR (Contoh)</w:t>
             </w:r>
           </w:p>
         </w:tc>
@@ -640,21 +407,21 @@
         </w:trPr>
         <w:tc>
           <w:tcPr>
-            <w:tcW w:w="5200" w:type="dxa"/>
-            <w:noWrap/>
-          </w:tcPr>
-          <w:p>
-            <w:pPr>
-              <w:spacing w:after="0"/>
-            </w:pPr>
-            <w:r>
-              <w:t>Alamat Email</w:t>
-            </w:r>
-          </w:p>
-        </w:tc>
-        <w:tc>
-          <w:tcPr>
-            <w:tcW w:w="300" w:type="dxa"/>
+            <w:tcW w:w="4106" w:type="dxa"/>
+            <w:noWrap/>
+          </w:tcPr>
+          <w:p>
+            <w:pPr>
+              <w:spacing w:after="0"/>
+            </w:pPr>
+            <w:r>
+              <w:t>Kontak PIC Akreditasi</w:t>
+            </w:r>
+          </w:p>
+        </w:tc>
+        <w:tc>
+          <w:tcPr>
+            <w:tcW w:w="284" w:type="dxa"/>
             <w:noWrap/>
           </w:tcPr>
           <w:p>
@@ -668,28 +435,102 @@
         </w:tc>
         <w:tc>
           <w:tcPr>
-            <w:tcW w:w="4706" w:type="dxa"/>
-            <w:noWrap/>
-          </w:tcPr>
-          <w:p>
-            <w:pPr>
-              <w:spacing w:after="0"/>
-            </w:pPr>
-          </w:p>
-        </w:tc>
-        <w:tc>
-          <w:tcPr>
-            <w:tcW w:w="1694" w:type="dxa"/>
-          </w:tcPr>
-          <w:p>
-            <w:pPr>
-              <w:spacing w:after="0"/>
-            </w:pPr>
-          </w:p>
-        </w:tc>
-        <w:tc>
-          <w:tcPr>
-            <w:tcW w:w="3200" w:type="dxa"/>
+            <w:tcW w:w="4961" w:type="dxa"/>
+            <w:noWrap/>
+          </w:tcPr>
+          <w:p>
+            <w:pPr>
+              <w:spacing w:after="0"/>
+            </w:pPr>
+            <w:r>
+              <w:t xml:space="preserve"> </w:t>
+            </w:r>
+          </w:p>
+        </w:tc>
+      </w:tr>
+      <w:tr>
+        <w:trPr>
+          <w:trHeight w:val="380"/>
+        </w:trPr>
+        <w:tc>
+          <w:tcPr>
+            <w:tcW w:w="4106" w:type="dxa"/>
+            <w:noWrap/>
+          </w:tcPr>
+          <w:p>
+            <w:pPr>
+              <w:spacing w:after="0"/>
+            </w:pPr>
+            <w:r>
+              <w:t>Telp</w:t>
+            </w:r>
+          </w:p>
+        </w:tc>
+        <w:tc>
+          <w:tcPr>
+            <w:tcW w:w="284" w:type="dxa"/>
+            <w:noWrap/>
+          </w:tcPr>
+          <w:p>
+            <w:pPr>
+              <w:spacing w:after="0"/>
+            </w:pPr>
+            <w:r>
+              <w:t>:</w:t>
+            </w:r>
+          </w:p>
+        </w:tc>
+        <w:tc>
+          <w:tcPr>
+            <w:tcW w:w="4961" w:type="dxa"/>
+            <w:noWrap/>
+          </w:tcPr>
+          <w:p>
+            <w:pPr>
+              <w:spacing w:after="0"/>
+            </w:pPr>
+            <w:r>
+              <w:t xml:space="preserve"> 024123456</w:t>
+            </w:r>
+          </w:p>
+        </w:tc>
+      </w:tr>
+      <w:tr>
+        <w:trPr>
+          <w:trHeight w:val="380"/>
+        </w:trPr>
+        <w:tc>
+          <w:tcPr>
+            <w:tcW w:w="4106" w:type="dxa"/>
+            <w:noWrap/>
+          </w:tcPr>
+          <w:p>
+            <w:pPr>
+              <w:spacing w:after="0"/>
+            </w:pPr>
+            <w:r>
+              <w:t>Mobile telp dan/atau WA</w:t>
+            </w:r>
+          </w:p>
+        </w:tc>
+        <w:tc>
+          <w:tcPr>
+            <w:tcW w:w="284" w:type="dxa"/>
+            <w:noWrap/>
+          </w:tcPr>
+          <w:p>
+            <w:pPr>
+              <w:spacing w:after="0"/>
+            </w:pPr>
+            <w:r>
+              <w:t>:</w:t>
+            </w:r>
+          </w:p>
+        </w:tc>
+        <w:tc>
+          <w:tcPr>
+            <w:tcW w:w="4961" w:type="dxa"/>
+            <w:noWrap/>
           </w:tcPr>
           <w:p>
             <w:pPr>
@@ -698,6 +539,50 @@
             <w:r>
               <w:t xml:space="preserve"> 088888888</w:t>
             </w:r>
+          </w:p>
+        </w:tc>
+      </w:tr>
+      <w:tr>
+        <w:trPr>
+          <w:trHeight w:val="380"/>
+        </w:trPr>
+        <w:tc>
+          <w:tcPr>
+            <w:tcW w:w="4106" w:type="dxa"/>
+            <w:noWrap/>
+          </w:tcPr>
+          <w:p>
+            <w:pPr>
+              <w:spacing w:after="0"/>
+            </w:pPr>
+            <w:r>
+              <w:t>Alamat email</w:t>
+            </w:r>
+          </w:p>
+        </w:tc>
+        <w:tc>
+          <w:tcPr>
+            <w:tcW w:w="284" w:type="dxa"/>
+            <w:noWrap/>
+          </w:tcPr>
+          <w:p>
+            <w:pPr>
+              <w:spacing w:after="0"/>
+            </w:pPr>
+            <w:r>
+              <w:t>:</w:t>
+            </w:r>
+          </w:p>
+        </w:tc>
+        <w:tc>
+          <w:tcPr>
+            <w:tcW w:w="4961" w:type="dxa"/>
+            <w:noWrap/>
+          </w:tcPr>
+          <w:p>
+            <w:pPr>
+              <w:spacing w:after="0"/>
+            </w:pPr>
           </w:p>
         </w:tc>
       </w:tr>
@@ -711,64 +596,64 @@
       <w:pPr>
         <w:spacing w:after="0"/>
       </w:pPr>
-      <w:proofErr w:type="spellStart"/>
       <w:r>
         <w:rPr>
           <w:b/>
           <w:bCs/>
         </w:rPr>
-        <w:t>Permohonan</w:t>
+        <w:t>Permohonan Akreditasi</w:t>
       </w:r>
-      <w:proofErr w:type="spellEnd"/>
-      <w:r>
-        <w:rPr>
-          <w:b/>
-          <w:bCs/>
-        </w:rPr>
-        <w:t xml:space="preserve"> </w:t>
-      </w:r>
-      <w:proofErr w:type="spellStart"/>
-      <w:r>
-        <w:rPr>
-          <w:b/>
-          <w:bCs/>
-        </w:rPr>
-        <w:t>Akreditasi</w:t>
-      </w:r>
-      <w:proofErr w:type="spellEnd"/>
     </w:p>
     <w:tbl>
       <w:tblPr>
         <w:tblStyle w:val="FormTable"/>
-        <w:tblW w:w="11320" w:type="dxa"/>
+        <w:tblW w:w="9351" w:type="dxa"/>
         <w:tblInd w:w="0" w:type="dxa"/>
+        <w:tblBorders>
+          <w:top w:val="none" w:sz="0" w:space="0" w:color="auto"/>
+          <w:left w:val="none" w:sz="0" w:space="0" w:color="auto"/>
+          <w:bottom w:val="none" w:sz="0" w:space="0" w:color="auto"/>
+          <w:right w:val="none" w:sz="0" w:space="0" w:color="auto"/>
+          <w:insideH w:val="none" w:sz="0" w:space="0" w:color="auto"/>
+          <w:insideV w:val="none" w:sz="0" w:space="0" w:color="auto"/>
+        </w:tblBorders>
         <w:tblLook w:val="04A0" w:firstRow="1" w:lastRow="0" w:firstColumn="1" w:lastColumn="0" w:noHBand="0" w:noVBand="1"/>
       </w:tblPr>
       <w:tblGrid>
-        <w:gridCol w:w="5245"/>
-        <w:gridCol w:w="284"/>
-        <w:gridCol w:w="5791"/>
+        <w:gridCol w:w="4105"/>
+        <w:gridCol w:w="299"/>
+        <w:gridCol w:w="4956"/>
       </w:tblGrid>
       <w:tr>
         <w:trPr>
-          <w:trHeight w:val="380"/>
+          <w:trHeight w:val="384"/>
         </w:trPr>
         <w:tc>
           <w:tcPr>
-            <w:tcW w:w="5245" w:type="dxa"/>
-            <w:noWrap/>
-          </w:tcPr>
-          <w:p>
-            <w:pPr>
-              <w:spacing w:after="0"/>
-            </w:pPr>
-            <w:proofErr w:type="spellStart"/>
-            <w:r>
-              <w:t>Akreditasi</w:t>
-            </w:r>
-            <w:proofErr w:type="spellEnd"/>
-            <w:r>
-              <w:t xml:space="preserve"> Saat Ini</w:t>
+            <w:tcW w:w="4106" w:type="dxa"/>
+            <w:noWrap/>
+          </w:tcPr>
+          <w:p>
+            <w:pPr>
+              <w:spacing w:after="0"/>
+            </w:pPr>
+            <w:r>
+              <w:t>Status a</w:t>
+            </w:r>
+            <w:r>
+              <w:t xml:space="preserve">kreditasi </w:t>
+            </w:r>
+            <w:r>
+              <w:t>s</w:t>
+            </w:r>
+            <w:r>
+              <w:t xml:space="preserve">aat </w:t>
+            </w:r>
+            <w:r>
+              <w:t>i</w:t>
+            </w:r>
+            <w:r>
+              <w:t>ni</w:t>
             </w:r>
           </w:p>
         </w:tc>
@@ -788,47 +673,35 @@
         </w:tc>
         <w:tc>
           <w:tcPr>
-            <w:tcW w:w="5791" w:type="dxa"/>
-            <w:noWrap/>
-          </w:tcPr>
-          <w:p>
-            <w:pPr>
-              <w:spacing w:after="0"/>
-            </w:pPr>
-            <w:proofErr w:type="spellStart"/>
-            <w:r>
-              <w:t>Terakreditasi</w:t>
-            </w:r>
-            <w:proofErr w:type="spellEnd"/>
+            <w:tcW w:w="4961" w:type="dxa"/>
+            <w:noWrap/>
+          </w:tcPr>
+          <w:p>
+            <w:pPr>
+              <w:spacing w:after="0"/>
+            </w:pPr>
+            <w:r>
+              <w:t xml:space="preserve">[sebutkan status terakhir] </w:t>
+            </w:r>
           </w:p>
         </w:tc>
       </w:tr>
       <w:tr>
         <w:trPr>
-          <w:trHeight w:val="380"/>
+          <w:trHeight w:val="384"/>
         </w:trPr>
         <w:tc>
           <w:tcPr>
-            <w:tcW w:w="5245" w:type="dxa"/>
-            <w:noWrap/>
-          </w:tcPr>
-          <w:p>
-            <w:pPr>
-              <w:spacing w:after="0"/>
-            </w:pPr>
-            <w:proofErr w:type="spellStart"/>
-            <w:r>
-              <w:t>Permohonan</w:t>
-            </w:r>
-            <w:proofErr w:type="spellEnd"/>
-            <w:r>
-              <w:t xml:space="preserve"> </w:t>
-            </w:r>
-            <w:proofErr w:type="spellStart"/>
-            <w:r>
-              <w:t>Akreditasi</w:t>
-            </w:r>
-            <w:proofErr w:type="spellEnd"/>
+            <w:tcW w:w="4106" w:type="dxa"/>
+            <w:noWrap/>
+          </w:tcPr>
+          <w:p>
+            <w:pPr>
+              <w:spacing w:after="0"/>
+            </w:pPr>
+            <w:r>
+              <w:t>Masa berlaku</w:t>
+            </w:r>
           </w:p>
         </w:tc>
         <w:tc>
@@ -847,7 +720,57 @@
         </w:tc>
         <w:tc>
           <w:tcPr>
-            <w:tcW w:w="5791" w:type="dxa"/>
+            <w:tcW w:w="4961" w:type="dxa"/>
+            <w:noWrap/>
+          </w:tcPr>
+          <w:p>
+            <w:pPr>
+              <w:spacing w:after="0"/>
+            </w:pPr>
+            <w:r>
+              <w:t xml:space="preserve">[sebutkan </w:t>
+            </w:r>
+            <w:r>
+              <w:t>kapan be</w:t>
+            </w:r>
+            <w:r>
+              <w:t xml:space="preserve">rakhir] </w:t>
+            </w:r>
+          </w:p>
+        </w:tc>
+      </w:tr>
+      <w:tr>
+        <w:trPr>
+          <w:trHeight w:val="384"/>
+        </w:trPr>
+        <w:tc>
+          <w:tcPr>
+            <w:tcW w:w="4106" w:type="dxa"/>
+            <w:noWrap/>
+          </w:tcPr>
+          <w:p>
+            <w:pPr>
+              <w:spacing w:after="0"/>
+            </w:pPr>
+            <w:r>
+              <w:t>Permohonan akreditasi</w:t>
+            </w:r>
+          </w:p>
+        </w:tc>
+        <w:tc>
+          <w:tcPr>
+            <w:tcW w:w="284" w:type="dxa"/>
+            <w:noWrap/>
+          </w:tcPr>
+          <w:p>
+            <w:pPr>
+              <w:spacing w:after="0"/>
+            </w:pPr>
+          </w:p>
+        </w:tc>
+        <w:tc>
+          <w:tcPr>
+            <w:tcW w:w="4961" w:type="dxa"/>
             <w:noWrap/>
           </w:tcPr>
           <w:p>
@@ -855,11 +778,60 @@
               <w:spacing w:after="0"/>
               <w:ind w:left="-2"/>
             </w:pPr>
-            <w:proofErr w:type="spellStart"/>
-            <w:r>
-              <w:t>Unggul</w:t>
-            </w:r>
-            <w:proofErr w:type="spellEnd"/>
+            <w:r>
+              <w:rPr>
+                <w:rFonts w:ascii="Wingdings" w:hAnsi="Wingdings"/>
+              </w:rPr>
+              <w:t xml:space="preserve">¨ </w:t>
+            </w:r>
+            <w:r>
+              <w:t>Terakreditasi Pertama</w:t>
+            </w:r>
+          </w:p>
+          <w:p>
+            <w:pPr>
+              <w:spacing w:after="0"/>
+              <w:ind w:left="-2"/>
+            </w:pPr>
+            <w:r>
+              <w:rPr>
+                <w:rFonts w:ascii="Wingdings" w:hAnsi="Wingdings"/>
+              </w:rPr>
+              <w:t xml:space="preserve">¨ </w:t>
+            </w:r>
+            <w:r>
+              <w:t>Terakreditasi (Konversi )</w:t>
+            </w:r>
+          </w:p>
+          <w:p>
+            <w:pPr>
+              <w:spacing w:after="0"/>
+              <w:ind w:left="-2"/>
+            </w:pPr>
+            <w:r>
+              <w:rPr>
+                <w:rFonts w:ascii="Wingdings" w:hAnsi="Wingdings"/>
+              </w:rPr>
+              <w:t xml:space="preserve">¨ </w:t>
+            </w:r>
+            <w:r>
+              <w:t>Terakreditasi (Perpanjangan)</w:t>
+            </w:r>
+          </w:p>
+          <w:p>
+            <w:pPr>
+              <w:spacing w:after="0"/>
+              <w:ind w:left="-2"/>
+            </w:pPr>
+            <w:r>
+              <w:rPr>
+                <w:rFonts w:ascii="Wingdings" w:hAnsi="Wingdings"/>
+              </w:rPr>
+              <w:t xml:space="preserve">¨ </w:t>
+            </w:r>
+            <w:r>
+              <w:t>Terakreditasi Unggul</w:t>
+            </w:r>
           </w:p>
         </w:tc>
       </w:tr>
@@ -868,18 +840,26 @@
     <w:tbl>
       <w:tblPr>
         <w:tblStyle w:val="SignTable"/>
-        <w:tblW w:w="0" w:type="auto"/>
+        <w:tblW w:w="9351" w:type="dxa"/>
         <w:tblInd w:w="0" w:type="dxa"/>
+        <w:tblBorders>
+          <w:top w:val="none" w:sz="0" w:space="0" w:color="auto"/>
+          <w:left w:val="none" w:sz="0" w:space="0" w:color="auto"/>
+          <w:bottom w:val="none" w:sz="0" w:space="0" w:color="auto"/>
+          <w:right w:val="none" w:sz="0" w:space="0" w:color="auto"/>
+          <w:insideH w:val="none" w:sz="0" w:space="0" w:color="auto"/>
+          <w:insideV w:val="none" w:sz="0" w:space="0" w:color="auto"/>
+        </w:tblBorders>
         <w:tblLook w:val="04A0" w:firstRow="1" w:lastRow="0" w:firstColumn="1" w:lastColumn="0" w:noHBand="0" w:noVBand="1"/>
       </w:tblPr>
       <w:tblGrid>
-        <w:gridCol w:w="5200"/>
-        <w:gridCol w:w="3500"/>
+        <w:gridCol w:w="4395"/>
+        <w:gridCol w:w="4965"/>
       </w:tblGrid>
       <w:tr>
         <w:tc>
           <w:tcPr>
-            <w:tcW w:w="5200" w:type="dxa"/>
+            <w:tcW w:w="4390" w:type="dxa"/>
             <w:noWrap/>
           </w:tcPr>
           <w:p>
@@ -890,122 +870,61 @@
         </w:tc>
         <w:tc>
           <w:tcPr>
-            <w:tcW w:w="3500" w:type="dxa"/>
+            <w:tcW w:w="4961" w:type="dxa"/>
             <w:noWrap/>
           </w:tcPr>
           <w:p>
             <w:pPr>
               <w:spacing w:after="120"/>
             </w:pPr>
-          </w:p>
+            <w:r>
+              <w:t>Tempat</w:t>
+            </w:r>
+            <w:r>
+              <w:t xml:space="preserve">, </w:t>
+            </w:r>
+            <w:r>
+              <w:t>tanggal bulan tahun</w:t>
+            </w:r>
+          </w:p>
+          <w:p/>
           <w:p>
             <w:pPr>
               <w:spacing w:after="120"/>
             </w:pPr>
-            <w:r>
-              <w:t>Semarang, 5 Januari 2026</w:t>
-            </w:r>
-          </w:p>
-          <w:p/>
-          <w:p>
-            <w:pPr>
-              <w:spacing w:after="120"/>
-            </w:pPr>
-            <w:proofErr w:type="spellStart"/>
             <w:r>
               <w:rPr>
                 <w:i/>
                 <w:iCs/>
                 <w:color w:val="BBBBBB"/>
               </w:rPr>
-              <w:t>Ttd</w:t>
-            </w:r>
-            <w:proofErr w:type="spellEnd"/>
+              <w:t>Ttd dan stemp</w:t>
+            </w:r>
+          </w:p>
+          <w:p>
+            <w:pPr>
+              <w:spacing w:after="480"/>
+            </w:pPr>
             <w:r>
               <w:rPr>
                 <w:i/>
                 <w:iCs/>
                 <w:color w:val="BBBBBB"/>
               </w:rPr>
-              <w:t xml:space="preserve"> dan </w:t>
-            </w:r>
-            <w:proofErr w:type="spellStart"/>
-            <w:r>
-              <w:rPr>
-                <w:i/>
-                <w:iCs/>
-                <w:color w:val="BBBBBB"/>
-              </w:rPr>
-              <w:t>stemp</w:t>
-            </w:r>
-            <w:proofErr w:type="spellEnd"/>
-          </w:p>
-          <w:p/>
-          <w:p>
-            <w:pPr>
-              <w:spacing w:after="480"/>
-            </w:pPr>
-            <w:proofErr w:type="spellStart"/>
-            <w:r>
-              <w:rPr>
-                <w:i/>
-                <w:iCs/>
-                <w:color w:val="BBBBBB"/>
-              </w:rPr>
-              <w:t>Ketua</w:t>
-            </w:r>
-            <w:proofErr w:type="spellEnd"/>
-            <w:r>
-              <w:rPr>
-                <w:i/>
-                <w:iCs/>
-                <w:color w:val="BBBBBB"/>
-              </w:rPr>
-              <w:t xml:space="preserve"> </w:t>
-            </w:r>
-            <w:proofErr w:type="spellStart"/>
-            <w:r>
-              <w:rPr>
-                <w:i/>
-                <w:iCs/>
-                <w:color w:val="BBBBBB"/>
-              </w:rPr>
-              <w:t>Penjaminan</w:t>
-            </w:r>
-            <w:proofErr w:type="spellEnd"/>
-            <w:r>
-              <w:rPr>
-                <w:i/>
-                <w:iCs/>
-                <w:color w:val="BBBBBB"/>
-              </w:rPr>
-              <w:t xml:space="preserve"> Mutu Universitas/UPPS</w:t>
+              <w:t>Ketua Penjaminan Mutu Universitas/UPPS</w:t>
             </w:r>
           </w:p>
           <w:p>
             <w:pPr>
               <w:spacing w:after="80"/>
             </w:pPr>
-            <w:proofErr w:type="gramStart"/>
-            <w:r>
-              <w:t>Nama :</w:t>
-            </w:r>
-            <w:proofErr w:type="gramEnd"/>
-            <w:r>
-              <w:t xml:space="preserve"> </w:t>
-            </w:r>
-          </w:p>
-          <w:p>
-            <w:r>
-              <w:t xml:space="preserve">NIP </w:t>
-            </w:r>
-            <w:proofErr w:type="gramStart"/>
-            <w:r>
-              <w:t xml:space="preserve">  :</w:t>
-            </w:r>
-            <w:proofErr w:type="gramEnd"/>
-            <w:r>
-              <w:t xml:space="preserve"> </w:t>
+            <w:r>
+              <w:t xml:space="preserve">Nama: </w:t>
+            </w:r>
+          </w:p>
+          <w:p>
+            <w:r>
+              <w:t xml:space="preserve">NIP: </w:t>
             </w:r>
           </w:p>
         </w:tc>
@@ -1081,31 +1000,7 @@
       <w:jc w:val="center"/>
     </w:pPr>
     <w:r>
-      <w:t xml:space="preserve">Mohon </w:t>
-    </w:r>
-    <w:proofErr w:type="spellStart"/>
-    <w:r>
-      <w:t>Sertakan</w:t>
-    </w:r>
-    <w:proofErr w:type="spellEnd"/>
-    <w:r>
-      <w:t xml:space="preserve"> Kop Surat Resmi </w:t>
-    </w:r>
-    <w:proofErr w:type="spellStart"/>
-    <w:r>
-      <w:t>dari</w:t>
-    </w:r>
-    <w:proofErr w:type="spellEnd"/>
-    <w:r>
-      <w:t xml:space="preserve"> </w:t>
-    </w:r>
-    <w:proofErr w:type="spellStart"/>
-    <w:r>
-      <w:t>Perguruan</w:t>
-    </w:r>
-    <w:proofErr w:type="spellEnd"/>
-    <w:r>
-      <w:t xml:space="preserve"> Tinggi/Program Studi Anda</w:t>
+      <w:t>Mohon Sertakan Kop Surat Resmi dari Perguruan Tinggi/Program Studi Anda</w:t>
     </w:r>
   </w:p>
   <w:p>

</xml_diff>